<commit_message>
Add analytics, cloud skills, update OG URL to donalsien.vercel.app
</commit_message>
<xml_diff>
--- a/public/resume/Kum_Donalsien_Akwo_Resume.docx
+++ b/public/resume/Kum_Donalsien_Akwo_Resume.docx
@@ -570,6 +570,23 @@
           <w:szCs w:val="24"/>
         </w:rPr>
         <w:t>Networking (Cisco IOS, Cisco Switches &amp; Routers, OSPF, BGP, IS-IS, RIP, Network Design, Wireless Networking, Network Architecture, IP Addressing)</w:t>
+      </w:r>
+    </w:p>
+    <w:p>
+      <w:pPr>
+        <w:pStyle w:val="ListBullet"/>
+        <w:spacing w:after="20"/>
+        <w:ind w:left="280" w:hanging="200"/>
+        <w:rPr>
+          <w:sz w:val="22"/>
+          <w:szCs w:val="24"/>
+        </w:rPr>
+      </w:pPr>
+      <w:r>
+        <w:rPr>
+          <w:szCs w:val="24"/>
+        </w:rPr>
+        <w:t>Cloud &amp; AWS (AWS EC2, S3, VPC, IAM, CloudFront, CloudWatch, Route 53, VPC design, cloud networking, cloud security)</w:t>
       </w:r>
     </w:p>
     <w:p>

</xml_diff>

<commit_message>
Add portfolio link to resume
</commit_message>
<xml_diff>
--- a/public/resume/Kum_Donalsien_Akwo_Resume.docx
+++ b/public/resume/Kum_Donalsien_Akwo_Resume.docx
@@ -84,6 +84,20 @@
         <w:t>kumdonalsien</w:t>
       </w:r>
       <w:proofErr w:type="spellEnd"/>
+      <w:r>
+        <w:rPr>
+          <w:sz w:val="24"/>
+        </w:rPr>
+        <w:t xml:space="preserve">  |  </w:t>
+      </w:r>
+      <w:hyperlink r:id="rId9">
+        <w:r>
+          <w:rPr>
+            <w:sz w:val="24"/>
+          </w:rPr>
+          <w:t>donalsien.vercel.app</w:t>
+        </w:r>
+      </w:hyperlink>
     </w:p>
     <w:tbl>
       <w:tblPr>

</xml_diff>

<commit_message>
Add certifications section with FCF cybersecurity badge
</commit_message>
<xml_diff>
--- a/public/resume/Kum_Donalsien_Akwo_Resume.docx
+++ b/public/resume/Kum_Donalsien_Akwo_Resume.docx
@@ -39,7 +39,7 @@
       <w:pPr>
         <w:spacing w:after="20"/>
         <w:rPr>
-          <w:sz w:val="28"/>
+          <w:sz w:val="24"/>
           <w:szCs w:val="32"/>
         </w:rPr>
       </w:pPr>
@@ -57,11 +57,51 @@
           <w:sz w:val="24"/>
           <w:szCs w:val="32"/>
         </w:rPr>
-        <w:t xml:space="preserve">  +237 671172400</w:t>
+        <w:t xml:space="preserve"> </w:t>
+      </w:r>
+      <w:hyperlink r:id="rId6" w:history="1">
+        <w:r>
+          <w:rPr>
+            <w:rStyle w:val="Hyperlink"/>
+            <w:sz w:val="24"/>
+            <w:szCs w:val="32"/>
+          </w:rPr>
+          <w:t>kum.donalsien@ubuea.cm</w:t>
+        </w:r>
+      </w:hyperlink>
+      <w:r>
+        <w:rPr>
+          <w:sz w:val="24"/>
+          <w:szCs w:val="32"/>
+        </w:rPr>
+        <w:t xml:space="preserve"> </w:t>
       </w:r>
     </w:p>
     <w:p>
       <w:pPr>
+        <w:spacing w:after="20"/>
+        <w:rPr>
+          <w:sz w:val="28"/>
+          <w:szCs w:val="32"/>
+        </w:rPr>
+      </w:pPr>
+      <w:r>
+        <w:rPr>
+          <w:sz w:val="24"/>
+          <w:szCs w:val="32"/>
+        </w:rPr>
+        <w:t>+237 671172400</w:t>
+      </w:r>
+      <w:r>
+        <w:rPr>
+          <w:sz w:val="24"/>
+          <w:szCs w:val="32"/>
+        </w:rPr>
+        <w:t xml:space="preserve"> | +237 676853145</w:t>
+      </w:r>
+    </w:p>
+    <w:p>
+      <w:pPr>
         <w:spacing w:after="80"/>
         <w:rPr>
           <w:sz w:val="28"/>
@@ -76,6 +116,7 @@
         <w:t>linkedin.com/in/</w:t>
       </w:r>
       <w:proofErr w:type="spellStart"/>
+      <w:proofErr w:type="gramStart"/>
       <w:r>
         <w:rPr>
           <w:sz w:val="24"/>
@@ -88,15 +129,24 @@
         <w:rPr>
           <w:sz w:val="24"/>
         </w:rPr>
-        <w:t xml:space="preserve">  |  </w:t>
+        <w:t xml:space="preserve">  |</w:t>
       </w:r>
-      <w:hyperlink r:id="rId9">
+      <w:proofErr w:type="gramEnd"/>
+      <w:r>
+        <w:rPr>
+          <w:sz w:val="24"/>
+        </w:rPr>
+        <w:t xml:space="preserve">  </w:t>
+      </w:r>
+      <w:hyperlink r:id="rId7">
+        <w:proofErr w:type="spellStart"/>
         <w:r>
           <w:rPr>
             <w:sz w:val="24"/>
           </w:rPr>
           <w:t>donalsien.vercel.app</w:t>
         </w:r>
+        <w:proofErr w:type="spellEnd"/>
       </w:hyperlink>
     </w:p>
     <w:tbl>
@@ -566,7 +616,19 @@
         <w:rPr>
           <w:szCs w:val="24"/>
         </w:rPr>
-        <w:t>Cyber security (Kali Linux, Wireshark, Nmap, Snort, Suricata, IDS/IPS, Ethical Hacking, Penetration Testing, Fortigate)</w:t>
+        <w:t>Cyber security (Kali Linux, Wireshark, Nmap, Snort, Suricata, IDS/IPS, Ethical Hacking, Penetration Testing, Fortigate</w:t>
+      </w:r>
+      <w:r>
+        <w:rPr>
+          <w:szCs w:val="24"/>
+        </w:rPr>
+        <w:t>, Data Security, Security Operations, Cyber Threat Intelligence, Social Engineering, Information Security</w:t>
+      </w:r>
+      <w:r>
+        <w:rPr>
+          <w:szCs w:val="24"/>
+        </w:rPr>
+        <w:t>)</w:t>
       </w:r>
     </w:p>
     <w:p>
@@ -634,7 +696,33 @@
         <w:rPr>
           <w:szCs w:val="24"/>
         </w:rPr>
-        <w:t>Frameworks &amp; Tools (FastAPI, React, Arduino, Scikit-learn, XGBoost, CatBoost, Keras/TensorFlow)</w:t>
+        <w:t>Frameworks &amp; Tools (FastAPI, React, Arduino, Scikit-learn, XGBoost, CatBoost, Keras/TensorFlow</w:t>
+      </w:r>
+      <w:r>
+        <w:rPr>
+          <w:szCs w:val="24"/>
+        </w:rPr>
+        <w:t xml:space="preserve">, </w:t>
+      </w:r>
+      <w:proofErr w:type="spellStart"/>
+      <w:r>
+        <w:rPr>
+          <w:szCs w:val="24"/>
+        </w:rPr>
+        <w:t>mitre</w:t>
+      </w:r>
+      <w:proofErr w:type="spellEnd"/>
+      <w:r>
+        <w:rPr>
+          <w:szCs w:val="24"/>
+        </w:rPr>
+        <w:t xml:space="preserve"> framework</w:t>
+      </w:r>
+      <w:r>
+        <w:rPr>
+          <w:szCs w:val="24"/>
+        </w:rPr>
+        <w:t>)</w:t>
       </w:r>
     </w:p>
     <w:p>
@@ -750,6 +838,7 @@
           <w:sz w:val="22"/>
           <w:szCs w:val="24"/>
         </w:rPr>
+        <w:lastRenderedPageBreak/>
         <w:t>TELNET CM</w:t>
       </w:r>
       <w:r>
@@ -815,7 +904,6 @@
         <w:rPr>
           <w:szCs w:val="24"/>
         </w:rPr>
-        <w:lastRenderedPageBreak/>
         <w:t>Gained hands-on experience with physical Cisco switches, routers, Fortigate firewalls and enterprise network infrastructure</w:t>
       </w:r>
     </w:p>
@@ -1508,6 +1596,33 @@
         </w:rPr>
         <w:t>Arduino Uno, C++, Embedded Systems</w:t>
       </w:r>
+    </w:p>
+    <w:p>
+      <w:pPr>
+        <w:spacing w:after="60"/>
+        <w:rPr>
+          <w:sz w:val="22"/>
+          <w:szCs w:val="24"/>
+        </w:rPr>
+      </w:pPr>
+    </w:p>
+    <w:p>
+      <w:pPr>
+        <w:spacing w:after="60"/>
+        <w:rPr>
+          <w:sz w:val="22"/>
+          <w:szCs w:val="24"/>
+        </w:rPr>
+      </w:pPr>
+    </w:p>
+    <w:p>
+      <w:pPr>
+        <w:spacing w:after="60"/>
+        <w:rPr>
+          <w:sz w:val="22"/>
+          <w:szCs w:val="24"/>
+        </w:rPr>
+      </w:pPr>
     </w:p>
     <w:p>
       <w:pPr>
@@ -2056,6 +2171,22 @@
         <w:spacing w:after="20"/>
         <w:ind w:left="280" w:hanging="200"/>
         <w:rPr>
+          <w:szCs w:val="24"/>
+        </w:rPr>
+      </w:pPr>
+      <w:r>
+        <w:rPr>
+          <w:szCs w:val="24"/>
+        </w:rPr>
+        <w:t>Fortinet Certified Fundamentals (FCF) in Cybersecurity, Fortinet (July 2026, valid to July 2028)</w:t>
+      </w:r>
+    </w:p>
+    <w:p>
+      <w:pPr>
+        <w:pStyle w:val="ListBullet"/>
+        <w:spacing w:after="20"/>
+        <w:ind w:left="280" w:hanging="200"/>
+        <w:rPr>
           <w:sz w:val="22"/>
           <w:szCs w:val="24"/>
         </w:rPr>
@@ -2116,82 +2247,6 @@
           <w:szCs w:val="24"/>
         </w:rPr>
         <w:t>Responsible Data Management</w:t>
-      </w:r>
-    </w:p>
-    <w:p>
-      <w:pPr>
-        <w:pStyle w:val="ListBullet"/>
-        <w:spacing w:after="20"/>
-        <w:ind w:left="280" w:hanging="200"/>
-        <w:rPr>
-          <w:sz w:val="22"/>
-          <w:szCs w:val="24"/>
-        </w:rPr>
-      </w:pPr>
-      <w:r>
-        <w:rPr>
-          <w:szCs w:val="24"/>
-        </w:rPr>
-        <w:t>Humanitarian Information Management</w:t>
-      </w:r>
-    </w:p>
-    <w:p>
-      <w:pPr>
-        <w:pStyle w:val="ListBullet"/>
-        <w:spacing w:after="20"/>
-        <w:ind w:left="280" w:hanging="200"/>
-        <w:rPr>
-          <w:sz w:val="22"/>
-          <w:szCs w:val="24"/>
-        </w:rPr>
-      </w:pPr>
-      <w:proofErr w:type="spellStart"/>
-      <w:r>
-        <w:rPr>
-          <w:szCs w:val="24"/>
-        </w:rPr>
-        <w:t>BSafe</w:t>
-      </w:r>
-      <w:proofErr w:type="spellEnd"/>
-      <w:r>
-        <w:rPr>
-          <w:szCs w:val="24"/>
-        </w:rPr>
-        <w:t xml:space="preserve"> Security Awareness</w:t>
-      </w:r>
-    </w:p>
-    <w:p>
-      <w:pPr>
-        <w:pStyle w:val="ListBullet"/>
-        <w:spacing w:after="20"/>
-        <w:ind w:left="280" w:hanging="200"/>
-        <w:rPr>
-          <w:sz w:val="22"/>
-          <w:szCs w:val="24"/>
-        </w:rPr>
-      </w:pPr>
-      <w:r>
-        <w:rPr>
-          <w:szCs w:val="24"/>
-        </w:rPr>
-        <w:t>Protection from Sexual Exploitation and Abuse (PSEA)</w:t>
-      </w:r>
-    </w:p>
-    <w:p>
-      <w:pPr>
-        <w:pStyle w:val="ListBullet"/>
-        <w:spacing w:after="20"/>
-        <w:ind w:left="280" w:hanging="200"/>
-        <w:rPr>
-          <w:sz w:val="22"/>
-          <w:szCs w:val="24"/>
-        </w:rPr>
-      </w:pPr>
-      <w:r>
-        <w:rPr>
-          <w:szCs w:val="24"/>
-        </w:rPr>
-        <w:t>Core Humanitarian Standard (CHS)</w:t>
       </w:r>
     </w:p>
     <w:p>
@@ -2335,7 +2390,38 @@
         <w:rPr>
           <w:szCs w:val="24"/>
         </w:rPr>
-        <w:t>Academic Excellence Recognition, Consistently maintaining a GPA of 3.62/4.0 throughout the degree programme</w:t>
+        <w:t xml:space="preserve">Academic Excellence Recognition, </w:t>
+      </w:r>
+      <w:proofErr w:type="gramStart"/>
+      <w:r>
+        <w:rPr>
+          <w:szCs w:val="24"/>
+        </w:rPr>
+        <w:t>Consistently</w:t>
+      </w:r>
+      <w:proofErr w:type="gramEnd"/>
+      <w:r>
+        <w:rPr>
+          <w:szCs w:val="24"/>
+        </w:rPr>
+        <w:t xml:space="preserve"> maintaining a GPA of 3.62/4.0 throughout the degree programme</w:t>
+      </w:r>
+    </w:p>
+    <w:p>
+      <w:pPr>
+        <w:pStyle w:val="ListBullet"/>
+        <w:spacing w:after="20"/>
+        <w:ind w:left="280" w:hanging="200"/>
+        <w:rPr>
+          <w:sz w:val="22"/>
+          <w:szCs w:val="24"/>
+        </w:rPr>
+      </w:pPr>
+      <w:r>
+        <w:rPr>
+          <w:szCs w:val="24"/>
+        </w:rPr>
+        <w:t>Leadership skills award from the College of Technology for demonstrating outstanding leadership capabilities in school</w:t>
       </w:r>
     </w:p>
     <w:p>
@@ -2582,6 +2668,9 @@
   </w:num>
   <w:num w:numId="9" w16cid:durableId="1486045269">
     <w:abstractNumId w:val="0"/>
+  </w:num>
+  <w:num w:numId="10" w16cid:durableId="972515522">
+    <w:abstractNumId w:val="8"/>
   </w:num>
 </w:numbering>
 </file>
@@ -3194,7 +3283,6 @@
   <w:style w:type="character" w:default="1" w:styleId="DefaultParagraphFont">
     <w:name w:val="Default Paragraph Font"/>
     <w:uiPriority w:val="1"/>
-    <w:semiHidden/>
     <w:unhideWhenUsed/>
   </w:style>
   <w:style w:type="table" w:default="1" w:styleId="TableNormal">
@@ -13970,6 +14058,29 @@
         <w:shd w:val="clear" w:color="auto" w:fill="FBCAA2" w:themeFill="accent6" w:themeFillTint="7F"/>
       </w:tcPr>
     </w:tblStylePr>
+  </w:style>
+  <w:style w:type="character" w:styleId="Hyperlink">
+    <w:name w:val="Hyperlink"/>
+    <w:basedOn w:val="DefaultParagraphFont"/>
+    <w:uiPriority w:val="99"/>
+    <w:unhideWhenUsed/>
+    <w:rsid w:val="00B439BC"/>
+    <w:rPr>
+      <w:color w:val="0000FF" w:themeColor="hyperlink"/>
+      <w:u w:val="single"/>
+    </w:rPr>
+  </w:style>
+  <w:style w:type="character" w:styleId="UnresolvedMention">
+    <w:name w:val="Unresolved Mention"/>
+    <w:basedOn w:val="DefaultParagraphFont"/>
+    <w:uiPriority w:val="99"/>
+    <w:semiHidden/>
+    <w:unhideWhenUsed/>
+    <w:rsid w:val="00B439BC"/>
+    <w:rPr>
+      <w:color w:val="605E5C"/>
+      <w:shd w:val="clear" w:color="auto" w:fill="E1DFDD"/>
+    </w:rPr>
   </w:style>
 </w:styles>
 </file>

</xml_diff>